<commit_message>
Phiên bản 1.1: đồng bộ nội dung phản biện (massage/thuật ngữ, giá tận nhà, vốn 165tr + phép tính, pháp lý NĐ 96/2023, nhân sự), DOCX tái cấu trúc + phụ lục B, HTML thêm sửa chữ (mã 1234321) + ẩn/hiện điều khiển (H/F)
</commit_message>
<xml_diff>
--- a/CareTouch-bao-cao.docx
+++ b/CareTouch-bao-cao.docx
@@ -101,7 +101,7 @@
           <w:color w:val="16302B"/>
           <w:sz w:val="25"/>
         </w:rPr>
-        <w:t>Dịch vụ matxa, trị liệu phục hồi chức năng và đả thông kinh lạc theo phương pháp y học cổ truyền — tại cơ sở và tận nhà</w:t>
+        <w:t>Dịch vụ massage – xoa bóp, bấm huyệt, gội đầu dưỡng sinh và chườm thảo dược theo phương pháp y học cổ truyền — hỗ trợ thư giãn cơ khớp; tại cơ sở và tận nhà</w:t>
       </w:r>
     </w:p>
     <w:p>
@@ -419,7 +419,7 @@
           <w:color w:val="16302B"/>
           <w:sz w:val="22"/>
         </w:rPr>
-        <w:t>2. Về dự án và việc đổi thương hiệu: An Khang Đường → CareTouch</w:t>
+        <w:t>2. Vấn đề và nhu cầu thị trường</w:t>
       </w:r>
     </w:p>
     <w:p>
@@ -434,7 +434,7 @@
           <w:color w:val="16302B"/>
           <w:sz w:val="22"/>
         </w:rPr>
-        <w:t>3. Vấn đề và nhu cầu thị trường</w:t>
+        <w:t>3. Khách hàng mục tiêu</w:t>
       </w:r>
     </w:p>
     <w:p>
@@ -449,7 +449,7 @@
           <w:color w:val="16302B"/>
           <w:sz w:val="22"/>
         </w:rPr>
-        <w:t>4. Khách hàng mục tiêu</w:t>
+        <w:t>4. Giải pháp: dịch vụ, giá và quy trình</w:t>
       </w:r>
     </w:p>
     <w:p>
@@ -464,7 +464,7 @@
           <w:color w:val="16302B"/>
           <w:sz w:val="22"/>
         </w:rPr>
-        <w:t>5. Giải pháp: dịch vụ, giá và quy trình</w:t>
+        <w:t>5. Gói dịch vụ và mô hình doanh thu lặp lại</w:t>
       </w:r>
     </w:p>
     <w:p>
@@ -479,7 +479,7 @@
           <w:color w:val="16302B"/>
           <w:sz w:val="22"/>
         </w:rPr>
-        <w:t>6. Gói dịch vụ và mô hình doanh thu lặp lại</w:t>
+        <w:t>6. Giá trị khác biệt và bối cảnh cạnh tranh</w:t>
       </w:r>
     </w:p>
     <w:p>
@@ -494,7 +494,7 @@
           <w:color w:val="16302B"/>
           <w:sz w:val="22"/>
         </w:rPr>
-        <w:t>7. Giá trị khác biệt và bối cảnh cạnh tranh</w:t>
+        <w:t>7. Nguồn lực, pháp lý và điều kiện vận hành</w:t>
       </w:r>
     </w:p>
     <w:p>
@@ -509,7 +509,7 @@
           <w:color w:val="16302B"/>
           <w:sz w:val="22"/>
         </w:rPr>
-        <w:t>8. Nguồn lực, pháp lý và điều kiện vận hành</w:t>
+        <w:t>8. Marketing và kênh tiếp cận khách hàng</w:t>
       </w:r>
     </w:p>
     <w:p>
@@ -524,7 +524,7 @@
           <w:color w:val="16302B"/>
           <w:sz w:val="22"/>
         </w:rPr>
-        <w:t>9. Marketing và kênh tiếp cận khách hàng</w:t>
+        <w:t>9. Tài chính dự phóng</w:t>
       </w:r>
     </w:p>
     <w:p>
@@ -539,7 +539,7 @@
           <w:color w:val="16302B"/>
           <w:sz w:val="22"/>
         </w:rPr>
-        <w:t>10. Tài chính dự phóng</w:t>
+        <w:t>10. Rủi ro và giải pháp ứng phó</w:t>
       </w:r>
     </w:p>
     <w:p>
@@ -554,7 +554,7 @@
           <w:color w:val="16302B"/>
           <w:sz w:val="22"/>
         </w:rPr>
-        <w:t>11. Rủi ro và phương án hóa giải</w:t>
+        <w:t>11. Lộ trình triển khai</w:t>
       </w:r>
     </w:p>
     <w:p>
@@ -569,22 +569,7 @@
           <w:color w:val="16302B"/>
           <w:sz w:val="22"/>
         </w:rPr>
-        <w:t>12. Lộ trình triển khai</w:t>
-      </w:r>
-    </w:p>
-    <w:p>
-      <w:pPr>
-        <w:spacing w:after="80"/>
-        <w:ind w:left="227"/>
-      </w:pPr>
-      <w:r>
-        <w:rPr>
-          <w:b w:val="0"/>
-          <w:i w:val="0"/>
-          <w:color w:val="16302B"/>
-          <w:sz w:val="22"/>
-        </w:rPr>
-        <w:t>13. Kết luận và khuyến nghị</w:t>
+        <w:t>12. Kết luận và khuyến nghị</w:t>
       </w:r>
     </w:p>
     <w:p>
@@ -615,6 +600,21 @@
           <w:sz w:val="22"/>
         </w:rPr>
         <w:t>Phụ lục A. Ghi chú quá trình lựa chọn ý tưởng</w:t>
+      </w:r>
+    </w:p>
+    <w:p>
+      <w:pPr>
+        <w:spacing w:after="80"/>
+        <w:ind w:left="227"/>
+      </w:pPr>
+      <w:r>
+        <w:rPr>
+          <w:b w:val="0"/>
+          <w:i w:val="0"/>
+          <w:color w:val="16302B"/>
+          <w:sz w:val="22"/>
+        </w:rPr>
+        <w:t>Phụ lục B. Ghi chú đổi thương hiệu: từ An Khang Đường đến CareTouch</w:t>
       </w:r>
     </w:p>
     <w:p>
@@ -651,7 +651,7 @@
           <w:i w:val="0"/>
           <w:color w:val="16302B"/>
         </w:rPr>
-        <w:t>CareTouch là dịch vụ chạm trị liệu theo y học cổ truyền Việt Nam — gội đầu dưỡng sinh thảo dược, matxa trị liệu, bấm huyệt đả thông kinh lạc, chườm thảo dược — phục vụ khách hàng tại cơ sở và tận nhà. Dự án được phát triển từ ý tưởng “An Khang Đường” của Nhóm 3, Lớp A1K79, và được đổi thương hiệu thành CareTouch với định vị quốc tế hơn: Healing Touch, Healthy Life.</w:t>
+        <w:t>CareTouch là dịch vụ chăm sóc sức khỏe bằng phương pháp chạm trị liệu của y học cổ truyền Việt Nam — gội đầu dưỡng sinh thảo dược, massage trị liệu, day ấn bấm huyệt và chườm thảo dược — hỗ trợ thư giãn, giảm mỏi cơ khớp; phục vụ khách hàng tại cơ sở và tận nhà. Dự án được phát triển từ ý tưởng “An Khang Đường” của Nhóm 3, Lớp A1K79, và được đổi thương hiệu thành CareTouch với định vị quốc tế hơn: Healing Touch, Healthy Life (lý do và so sánh chi tiết tại Phụ lục B).</w:t>
       </w:r>
     </w:p>
     <w:p>
@@ -661,7 +661,7 @@
           <w:i w:val="0"/>
           <w:color w:val="16302B"/>
         </w:rPr>
-        <w:t>Dự án nhắm vào một khoảng trống rất cụ thể của thị trường: người trung niên và cao tuổi — nhóm dân số tăng nhanh nhất và sẵn chi trả nhất cho việc chăm sóc sức khỏe — chưa được các dịch vụ chạm trị liệu phục vụ một cách bài bản, an toàn và thuận tiện. Spa cao cấp hướng tới khách trẻ với giá cao; các quán massage nhỏ thì thiếu quy trình và niềm tin. CareTouch đặt mình vào chính khoảng giữa đó: trị liệu cổ truyền có kiểm chứng về an toàn, giá minh bạch 120.000–290.000 đồng mỗi phiên, và phục vụ tận giường, tận nhà.</w:t>
+        <w:t>Dự án nhắm vào một khoảng trống rất cụ thể của thị trường: người trung niên và cao tuổi — nhóm dân số tăng nhanh nhất và sẵn chi trả nhất cho việc chăm sóc sức khỏe — chưa được các dịch vụ chạm trị liệu phục vụ một cách bài bản, an toàn và thuận tiện. Spa cao cấp hướng tới khách trẻ với giá cao; các quán massage nhỏ thì thiếu quy trình và niềm tin. CareTouch đặt mình vào chính khoảng giữa đó: trị liệu cổ truyền có kiểm chứng về an toàn, giá minh bạch 120.000–320.000 đồng mỗi phiên, và phục vụ tận giường, tận nhà.</w:t>
       </w:r>
     </w:p>
     <w:p>
@@ -681,7 +681,7 @@
           <w:i w:val="0"/>
           <w:color w:val="16302B"/>
         </w:rPr>
-        <w:t>Về mặt vận hành, mô hình cần vốn ban đầu khoảng 95 triệu đồng, có điểm hòa vốn dự kiến vào tháng thứ năm và hoàn vốn trong 12–14 tháng nếu tỷ lệ khách quay lại đạt từ 55%. Bên dưới là bốn trụ cột tạo nên khác biệt của CareTouch:</w:t>
+        <w:t>Về mặt vận hành, tổng nhu cầu vốn khởi đầu khoảng 165 triệu đồng, gồm 95 triệu đồng đầu tư ban đầu và 70 triệu đồng vốn lưu động bù lỗ giai đoạn đầu (phép tính chi tiết tại chương 9). Doanh thu vượt chi phí cố định từ tháng thứ năm; theo kịch bản cơ sở, toàn bộ 165 triệu đồng vốn được thu hồi trong khoảng 12 tháng, kịch bản thận trọng với tỷ lệ khách quay lại 55% hoàn vốn trong 12–14 tháng. Bên dưới là bốn trụ cột tạo nên khác biệt của CareTouch:</w:t>
       </w:r>
     </w:p>
     <w:p>
@@ -717,7 +717,7 @@
           <w:i w:val="0"/>
           <w:color w:val="16302B"/>
         </w:rPr>
-        <w:t xml:space="preserve">An toàn có sàng lọc: </w:t>
+        <w:t xml:space="preserve">An toàn được kiểm soát ngay từ đầu: </w:t>
       </w:r>
       <w:r>
         <w:rPr>
@@ -725,7 +725,7 @@
           <w:i w:val="0"/>
           <w:color w:val="16302B"/>
         </w:rPr>
-        <w:t>mọi buổi đều bắt đầu bằng hỏi bệnh nền và đo huyết áp — không an toàn thì không thực hiện.</w:t>
+        <w:t>mọi buổi đều bắt đầu bằng khảo sát thể trạng (hỏi bệnh nền, đo huyết áp); không an toàn thì không thực hiện.</w:t>
       </w:r>
     </w:p>
     <w:p>
@@ -777,408 +777,7 @@
         <w:pStyle w:val="Heading1"/>
       </w:pPr>
       <w:r>
-        <w:t>2. Về dự án và việc đổi thương hiệu: An Khang Đường → CareTouch</w:t>
-      </w:r>
-    </w:p>
-    <w:p>
-      <w:r>
-        <w:rPr>
-          <w:b w:val="0"/>
-          <w:i w:val="0"/>
-          <w:color w:val="16302B"/>
-        </w:rPr>
-        <w:t>Tên ban đầu “An Khang Đường” mang ý nghĩa tốt đẹp — “An Khang” là mong ước sức khỏe bình an, “Đường” theo cách đặt tên các nhà thuốc, cơ sở y học cổ truyền xưa. Tuy nhiên, khi dự án bước vào giai đoạn chuẩn bị gọi vốn và mở rộng, nhóm nhận thấy tên gọi này bộc lộ ba hạn chế: khó phát âm với đối tác quốc tế và khách hàng trẻ; dài, khó nhớ trên kênh số (Zalo, Facebook, ứng dụng đặt lịch); và hình ảnh “cửa hàng thuốc cổ” dễ khiến khách hàng nhầm lẫn phạm vi dịch vụ.</w:t>
-      </w:r>
-    </w:p>
-    <w:p>
-      <w:pPr>
-        <w:spacing w:after="0"/>
-      </w:pPr>
-      <w:r>
-        <w:rPr>
-          <w:b w:val="0"/>
-          <w:i w:val="0"/>
-          <w:color w:val="16302B"/>
-        </w:rPr>
-        <w:t xml:space="preserve">Sau khi đánh giá nhiều phương án, nhóm chọn tên </w:t>
-      </w:r>
-      <w:r>
-        <w:rPr>
-          <w:b/>
-          <w:i w:val="0"/>
-          <w:color w:val="E8590C"/>
-        </w:rPr>
-        <w:t>CareTouch</w:t>
-      </w:r>
-      <w:r>
-        <w:rPr>
-          <w:b w:val="0"/>
-          <w:i w:val="0"/>
-          <w:color w:val="16302B"/>
-        </w:rPr>
-        <w:t xml:space="preserve"> — ghép hai chữ “Care” (sự chăm sóc chu đáo) và “Touch” (cái chạm trị liệu). Tên gọi nói đúng bản chất dịch vụ: chữa lành bằng đôi tay, đồng thời gợi cảm giác tận tâm. Slogan kèm theo: </w:t>
-      </w:r>
-      <w:r>
-        <w:rPr>
-          <w:b/>
-          <w:i/>
-          <w:color w:val="16302B"/>
-        </w:rPr>
-        <w:t>“CareTouch – Healing Touch, Healthy Life”</w:t>
-      </w:r>
-      <w:r>
-        <w:rPr>
-          <w:b w:val="0"/>
-          <w:i w:val="0"/>
-          <w:color w:val="16302B"/>
-        </w:rPr>
-        <w:t xml:space="preserve"> (Chạm trị liệu — Sống khỏe mỗi ngày).</w:t>
-      </w:r>
-    </w:p>
-    <w:p>
-      <w:r>
-        <w:rPr>
-          <w:b w:val="0"/>
-          <w:i w:val="0"/>
-          <w:color w:val="16302B"/>
-        </w:rPr>
-        <w:t>Bảng dưới đây tóm tắt lý do đổi tên:</w:t>
-      </w:r>
-    </w:p>
-    <w:tbl>
-      <w:tblPr>
-        <w:tblStyle w:val="TableGrid"/>
-        <w:tblW w:type="auto" w:w="0"/>
-        <w:jc w:val="center"/>
-        <w:tblLook w:firstColumn="1" w:firstRow="1" w:lastColumn="0" w:lastRow="0" w:noHBand="0" w:noVBand="1" w:val="04A0"/>
-        <w:tblBorders>
-          <w:top w:val="single" w:sz="4" w:color="DCEBE6"/>
-          <w:left w:val="single" w:sz="4" w:color="DCEBE6"/>
-          <w:bottom w:val="single" w:sz="4" w:color="DCEBE6"/>
-          <w:right w:val="single" w:sz="4" w:color="DCEBE6"/>
-          <w:insideH w:val="single" w:sz="4" w:color="DCEBE6"/>
-          <w:insideV w:val="single" w:sz="4" w:color="DCEBE6"/>
-        </w:tblBorders>
-      </w:tblPr>
-      <w:tblGrid>
-        <w:gridCol w:w="3061"/>
-        <w:gridCol w:w="3061"/>
-        <w:gridCol w:w="3061"/>
-      </w:tblGrid>
-      <w:tr>
-        <w:tc>
-          <w:tcPr>
-            <w:tcW w:type="dxa" w:w="2041"/>
-            <w:shd w:val="clear" w:color="auto" w:fill="0E7C6B"/>
-          </w:tcPr>
-          <w:p>
-            <w:pPr>
-              <w:spacing w:after="40" w:before="40"/>
-            </w:pPr>
-            <w:r>
-              <w:rPr>
-                <w:rFonts w:ascii="Segoe UI" w:hAnsi="Segoe UI"/>
-                <w:b/>
-                <w:color w:val="FFFFFF"/>
-                <w:sz w:val="21"/>
-              </w:rPr>
-              <w:t>Tiêu chí</w:t>
-            </w:r>
-          </w:p>
-        </w:tc>
-        <w:tc>
-          <w:tcPr>
-            <w:tcW w:type="dxa" w:w="3175"/>
-            <w:shd w:val="clear" w:color="auto" w:fill="0E7C6B"/>
-          </w:tcPr>
-          <w:p>
-            <w:pPr>
-              <w:spacing w:after="40" w:before="40"/>
-            </w:pPr>
-            <w:r>
-              <w:rPr>
-                <w:rFonts w:ascii="Segoe UI" w:hAnsi="Segoe UI"/>
-                <w:b/>
-                <w:color w:val="FFFFFF"/>
-                <w:sz w:val="21"/>
-              </w:rPr>
-              <w:t>An Khang Đường</w:t>
-            </w:r>
-          </w:p>
-        </w:tc>
-        <w:tc>
-          <w:tcPr>
-            <w:tcW w:type="dxa" w:w="3742"/>
-            <w:shd w:val="clear" w:color="auto" w:fill="0E7C6B"/>
-          </w:tcPr>
-          <w:p>
-            <w:pPr>
-              <w:spacing w:after="40" w:before="40"/>
-            </w:pPr>
-            <w:r>
-              <w:rPr>
-                <w:rFonts w:ascii="Segoe UI" w:hAnsi="Segoe UI"/>
-                <w:b/>
-                <w:color w:val="FFFFFF"/>
-                <w:sz w:val="21"/>
-              </w:rPr>
-              <w:t>CareTouch</w:t>
-            </w:r>
-          </w:p>
-        </w:tc>
-      </w:tr>
-      <w:tr>
-        <w:tc>
-          <w:tcPr>
-            <w:tcW w:type="dxa" w:w="2041"/>
-          </w:tcPr>
-          <w:p>
-            <w:pPr>
-              <w:spacing w:after="40" w:before="40"/>
-            </w:pPr>
-            <w:r>
-              <w:rPr>
-                <w:rFonts w:ascii="Segoe UI" w:hAnsi="Segoe UI"/>
-                <w:color w:val="16302B"/>
-                <w:sz w:val="21"/>
-              </w:rPr>
-              <w:t>Khả năng ghi nhớ</w:t>
-            </w:r>
-          </w:p>
-        </w:tc>
-        <w:tc>
-          <w:tcPr>
-            <w:tcW w:type="dxa" w:w="3175"/>
-          </w:tcPr>
-          <w:p>
-            <w:pPr>
-              <w:spacing w:after="40" w:before="40"/>
-            </w:pPr>
-            <w:r>
-              <w:rPr>
-                <w:rFonts w:ascii="Segoe UI" w:hAnsi="Segoe UI"/>
-                <w:color w:val="16302B"/>
-                <w:sz w:val="21"/>
-              </w:rPr>
-              <w:t>Dài, dễ nhầm với nhà thuốc</w:t>
-            </w:r>
-          </w:p>
-        </w:tc>
-        <w:tc>
-          <w:tcPr>
-            <w:tcW w:type="dxa" w:w="3742"/>
-          </w:tcPr>
-          <w:p>
-            <w:pPr>
-              <w:spacing w:after="40" w:before="40"/>
-            </w:pPr>
-            <w:r>
-              <w:rPr>
-                <w:rFonts w:ascii="Segoe UI" w:hAnsi="Segoe UI"/>
-                <w:color w:val="16302B"/>
-                <w:sz w:val="21"/>
-              </w:rPr>
-              <w:t>Hai âm tiết, đọc đúng ngay lần đầu</w:t>
-            </w:r>
-          </w:p>
-        </w:tc>
-      </w:tr>
-      <w:tr>
-        <w:tc>
-          <w:tcPr>
-            <w:tcW w:type="dxa" w:w="2041"/>
-            <w:shd w:val="clear" w:color="auto" w:fill="F4FAF8"/>
-          </w:tcPr>
-          <w:p>
-            <w:pPr>
-              <w:spacing w:after="40" w:before="40"/>
-            </w:pPr>
-            <w:r>
-              <w:rPr>
-                <w:rFonts w:ascii="Segoe UI" w:hAnsi="Segoe UI"/>
-                <w:color w:val="16302B"/>
-                <w:sz w:val="21"/>
-              </w:rPr>
-              <w:t>Khách hàng quốc tế</w:t>
-            </w:r>
-          </w:p>
-        </w:tc>
-        <w:tc>
-          <w:tcPr>
-            <w:tcW w:type="dxa" w:w="3175"/>
-            <w:shd w:val="clear" w:color="auto" w:fill="F4FAF8"/>
-          </w:tcPr>
-          <w:p>
-            <w:pPr>
-              <w:spacing w:after="40" w:before="40"/>
-            </w:pPr>
-            <w:r>
-              <w:rPr>
-                <w:rFonts w:ascii="Segoe UI" w:hAnsi="Segoe UI"/>
-                <w:color w:val="16302B"/>
-                <w:sz w:val="21"/>
-              </w:rPr>
-              <w:t>Khó phát âm, khó viết</w:t>
-            </w:r>
-          </w:p>
-        </w:tc>
-        <w:tc>
-          <w:tcPr>
-            <w:tcW w:type="dxa" w:w="3742"/>
-            <w:shd w:val="clear" w:color="auto" w:fill="F4FAF8"/>
-          </w:tcPr>
-          <w:p>
-            <w:pPr>
-              <w:spacing w:after="40" w:before="40"/>
-            </w:pPr>
-            <w:r>
-              <w:rPr>
-                <w:rFonts w:ascii="Segoe UI" w:hAnsi="Segoe UI"/>
-                <w:color w:val="16302B"/>
-                <w:sz w:val="21"/>
-              </w:rPr>
-              <w:t>Tiếng Anh đơn giản, phù hợp khách du lịch chăm sóc sức khỏe</w:t>
-            </w:r>
-          </w:p>
-        </w:tc>
-      </w:tr>
-      <w:tr>
-        <w:tc>
-          <w:tcPr>
-            <w:tcW w:type="dxa" w:w="2041"/>
-          </w:tcPr>
-          <w:p>
-            <w:pPr>
-              <w:spacing w:after="40" w:before="40"/>
-            </w:pPr>
-            <w:r>
-              <w:rPr>
-                <w:rFonts w:ascii="Segoe UI" w:hAnsi="Segoe UI"/>
-                <w:color w:val="16302B"/>
-                <w:sz w:val="21"/>
-              </w:rPr>
-              <w:t>Hình ảnh số</w:t>
-            </w:r>
-          </w:p>
-        </w:tc>
-        <w:tc>
-          <w:tcPr>
-            <w:tcW w:type="dxa" w:w="3175"/>
-          </w:tcPr>
-          <w:p>
-            <w:pPr>
-              <w:spacing w:after="40" w:before="40"/>
-            </w:pPr>
-            <w:r>
-              <w:rPr>
-                <w:rFonts w:ascii="Segoe UI" w:hAnsi="Segoe UI"/>
-                <w:color w:val="16302B"/>
-                <w:sz w:val="21"/>
-              </w:rPr>
-              <w:t>Kém phù hợp làm app/website</w:t>
-            </w:r>
-          </w:p>
-        </w:tc>
-        <w:tc>
-          <w:tcPr>
-            <w:tcW w:type="dxa" w:w="3742"/>
-          </w:tcPr>
-          <w:p>
-            <w:pPr>
-              <w:spacing w:after="40" w:before="40"/>
-            </w:pPr>
-            <w:r>
-              <w:rPr>
-                <w:rFonts w:ascii="Segoe UI" w:hAnsi="Segoe UI"/>
-                <w:color w:val="16302B"/>
-                <w:sz w:val="21"/>
-              </w:rPr>
-              <w:t>Thân thiện logo, ứng dụng, mạng xã hội</w:t>
-            </w:r>
-          </w:p>
-        </w:tc>
-      </w:tr>
-      <w:tr>
-        <w:tc>
-          <w:tcPr>
-            <w:tcW w:type="dxa" w:w="2041"/>
-            <w:shd w:val="clear" w:color="auto" w:fill="F4FAF8"/>
-          </w:tcPr>
-          <w:p>
-            <w:pPr>
-              <w:spacing w:after="40" w:before="40"/>
-            </w:pPr>
-            <w:r>
-              <w:rPr>
-                <w:rFonts w:ascii="Segoe UI" w:hAnsi="Segoe UI"/>
-                <w:color w:val="16302B"/>
-                <w:sz w:val="21"/>
-              </w:rPr>
-              <w:t>Thông điệp</w:t>
-            </w:r>
-          </w:p>
-        </w:tc>
-        <w:tc>
-          <w:tcPr>
-            <w:tcW w:type="dxa" w:w="3175"/>
-            <w:shd w:val="clear" w:color="auto" w:fill="F4FAF8"/>
-          </w:tcPr>
-          <w:p>
-            <w:pPr>
-              <w:spacing w:after="40" w:before="40"/>
-            </w:pPr>
-            <w:r>
-              <w:rPr>
-                <w:rFonts w:ascii="Segoe UI" w:hAnsi="Segoe UI"/>
-                <w:color w:val="16302B"/>
-                <w:sz w:val="21"/>
-              </w:rPr>
-              <w:t>Mong ước chung chung</w:t>
-            </w:r>
-          </w:p>
-        </w:tc>
-        <w:tc>
-          <w:tcPr>
-            <w:tcW w:type="dxa" w:w="3742"/>
-            <w:shd w:val="clear" w:color="auto" w:fill="F4FAF8"/>
-          </w:tcPr>
-          <w:p>
-            <w:pPr>
-              <w:spacing w:after="40" w:before="40"/>
-            </w:pPr>
-            <w:r>
-              <w:rPr>
-                <w:rFonts w:ascii="Segoe UI" w:hAnsi="Segoe UI"/>
-                <w:color w:val="16302B"/>
-                <w:sz w:val="21"/>
-              </w:rPr>
-              <w:t>Nói đúng phương pháp: chữa lành bằng đôi tay</w:t>
-            </w:r>
-          </w:p>
-        </w:tc>
-      </w:tr>
-    </w:tbl>
-    <w:p>
-      <w:pPr>
-        <w:spacing w:after="200" w:before="40"/>
-        <w:jc w:val="center"/>
-      </w:pPr>
-      <w:r>
-        <w:rPr>
-          <w:b w:val="0"/>
-          <w:i/>
-          <w:color w:val="5C7370"/>
-          <w:sz w:val="19"/>
-        </w:rPr>
-        <w:t>Bảng 1. So sánh tên gọi cũ và mới</w:t>
-      </w:r>
-    </w:p>
-    <w:p>
-      <w:pPr>
-        <w:pStyle w:val="Heading1"/>
-      </w:pPr>
-      <w:r>
-        <w:t>3. Vấn đề và nhu cầu thị trường</w:t>
+        <w:t>2. Vấn đề và nhu cầu thị trường</w:t>
       </w:r>
     </w:p>
     <w:p>
@@ -1186,7 +785,7 @@
         <w:pStyle w:val="Heading2"/>
       </w:pPr>
       <w:r>
-        <w:t>3.1. Ba nhóm người, một vấn đề chung</w:t>
+        <w:t>2.1. Ba nhóm người, một vấn đề chung</w:t>
       </w:r>
     </w:p>
     <w:p>
@@ -1280,7 +879,7 @@
         <w:pStyle w:val="Heading2"/>
       </w:pPr>
       <w:r>
-        <w:t>3.2. Dân số già hóa — nhu cầu có sẵn và tăng theo từng năm</w:t>
+        <w:t>2.2. Dân số già hóa — nhu cầu có sẵn và tăng theo từng năm</w:t>
       </w:r>
     </w:p>
     <w:p>
@@ -1353,7 +952,7 @@
         <w:pStyle w:val="Heading2"/>
       </w:pPr>
       <w:r>
-        <w:t>3.3. Chi tiêu sức khỏe tăng đều</w:t>
+        <w:t>2.3. Chi tiêu sức khỏe tăng đều</w:t>
       </w:r>
     </w:p>
     <w:p>
@@ -1426,7 +1025,7 @@
         <w:pStyle w:val="Heading2"/>
       </w:pPr>
       <w:r>
-        <w:t>3.4. Kinh tế wellness: Việt Nam là “ngôi sao tăng trưởng” của châu Á</w:t>
+        <w:t>2.4. Kinh tế wellness: Việt Nam là “ngôi sao tăng trưởng” của châu Á</w:t>
       </w:r>
     </w:p>
     <w:p>
@@ -1509,7 +1108,7 @@
         <w:pStyle w:val="Heading1"/>
       </w:pPr>
       <w:r>
-        <w:t>4. Khách hàng mục tiêu</w:t>
+        <w:t>3. Khách hàng mục tiêu</w:t>
       </w:r>
     </w:p>
     <w:tbl>
@@ -1778,7 +1377,7 @@
           <w:color w:val="5C7370"/>
           <w:sz w:val="19"/>
         </w:rPr>
-        <w:t>Bảng 2. Phân khúc khách hàng mục tiêu</w:t>
+        <w:t>Bảng 1. Phân khúc khách hàng mục tiêu</w:t>
       </w:r>
     </w:p>
     <w:p>
@@ -1806,7 +1405,7 @@
           <w:i w:val="0"/>
           <w:color w:val="16302B"/>
         </w:rPr>
-        <w:t>). Với mức giá 120.000–290.000 đồng một phiên — tương đương một bữa cơm gia đình — dịch vụ nằm trong khả năng chi trả định kỳ của nhóm mục tiêu. Khảo sát thị trường cho thấy khách hàng đô thị sẵn sàng chi 250.000–500.000 đồng mỗi buổi cho liệu trình chất lượng, hoặc mua trọn gói 2,5–5 triệu đồng.</w:t>
+        <w:t>). Với mức giá 120.000–320.000 đồng một phiên — tương đương một bữa cơm gia đình — dịch vụ nằm trong khả năng chi trả định kỳ của nhóm mục tiêu. Khảo sát thị trường cho thấy khách hàng đô thị sẵn sàng chi 250.000–500.000 đồng mỗi buổi cho liệu trình chất lượng, hoặc mua trọn gói 2,5–5 triệu đồng.</w:t>
       </w:r>
     </w:p>
     <w:p>
@@ -1814,7 +1413,7 @@
         <w:pStyle w:val="Heading1"/>
       </w:pPr>
       <w:r>
-        <w:t>5. Giải pháp: dịch vụ, giá và quy trình</w:t>
+        <w:t>4. Giải pháp: dịch vụ, giá và quy trình</w:t>
       </w:r>
     </w:p>
     <w:p>
@@ -1822,7 +1421,7 @@
         <w:pStyle w:val="Heading2"/>
       </w:pPr>
       <w:r>
-        <w:t>5.1. Danh mục dịch vụ và giá đề xuất</w:t>
+        <w:t>4.1. Danh mục dịch vụ và giá đề xuất</w:t>
       </w:r>
     </w:p>
     <w:p>
@@ -2007,7 +1606,7 @@
                 <w:color w:val="16302B"/>
                 <w:sz w:val="21"/>
               </w:rPr>
-              <w:t>180.000</w:t>
+              <w:t>200.000</w:t>
             </w:r>
           </w:p>
         </w:tc>
@@ -2028,7 +1627,7 @@
                 <w:color w:val="16302B"/>
                 <w:sz w:val="21"/>
               </w:rPr>
-              <w:t>Matxa cổ – vai – gáy trị liệu</w:t>
+              <w:t>Massage cổ – vai – gáy trị liệu</w:t>
             </w:r>
           </w:p>
         </w:tc>
@@ -2085,7 +1684,7 @@
                 <w:color w:val="16302B"/>
                 <w:sz w:val="21"/>
               </w:rPr>
-              <w:t>250.000</w:t>
+              <w:t>270.000</w:t>
             </w:r>
           </w:p>
         </w:tc>
@@ -2105,7 +1704,7 @@
                 <w:color w:val="16302B"/>
                 <w:sz w:val="21"/>
               </w:rPr>
-              <w:t>Matxa toàn thân thư giãn</w:t>
+              <w:t>Massage toàn thân thư giãn</w:t>
             </w:r>
           </w:p>
         </w:tc>
@@ -2159,7 +1758,7 @@
                 <w:color w:val="16302B"/>
                 <w:sz w:val="21"/>
               </w:rPr>
-              <w:t>290.000</w:t>
+              <w:t>320.000</w:t>
             </w:r>
           </w:p>
         </w:tc>
@@ -2237,7 +1836,7 @@
                 <w:color w:val="16302B"/>
                 <w:sz w:val="21"/>
               </w:rPr>
-              <w:t>270.000</w:t>
+              <w:t>290.000</w:t>
             </w:r>
           </w:p>
         </w:tc>
@@ -2329,7 +1928,7 @@
           <w:color w:val="5C7370"/>
           <w:sz w:val="19"/>
         </w:rPr>
-        <w:t>Bảng 3. Danh mục dịch vụ và giá đề xuất (VNĐ/phiên). Nguồn tham chiếu giá thị trường: Massagenha, 7/2025.</w:t>
+        <w:t>Bảng 2. Danh mục dịch vụ và giá đề xuất (VNĐ/phiên). Nguồn tham chiếu giá thị trường: Massagenha, 7/2025.</w:t>
       </w:r>
     </w:p>
     <w:p>
@@ -2339,7 +1938,7 @@
           <w:i w:val="0"/>
           <w:color w:val="16302B"/>
         </w:rPr>
-        <w:t>Phục vụ tận nhà miễn phí trong bán kính 5 km; xa hơn phụ thu 20.000 đồng mỗi 5 km. Các con số sẽ được hiệu chỉnh theo địa bàn triển khai thực tế.</w:t>
+        <w:t>Phục vụ tận nhà miễn phí trong bán kính 5 km; xa hơn phụ thu 20.000 đồng mỗi 5 km, và khách được khuyến nghị đặt tối thiểu 2 buổi mỗi lượt. Mức chênh lệch 80.000–100.000 đồng giữa dịch vụ tận nhà và tại cơ sở được tính từ thời gian thực tế của một ca tại nhà: 45–60 phút trị liệu cộng 30–45 phút di chuyển và chuẩn bị, tức khoảng 1,5–2 tiếng mỗi ca — nhờ đó thu nhập trên mỗi giờ làm việc của kỹ thuật viên không bị suy giảm so với phục vụ tại cơ sở. Các con số sẽ được hiệu chỉnh theo địa bàn triển khai thực tế.</w:t>
       </w:r>
     </w:p>
     <w:p>
@@ -2347,7 +1946,7 @@
         <w:pStyle w:val="Heading2"/>
       </w:pPr>
       <w:r>
-        <w:t>5.2. Quy trình một buổi trị liệu chuẩn</w:t>
+        <w:t>4.2. Quy trình một buổi trị liệu chuẩn</w:t>
       </w:r>
     </w:p>
     <w:p>
@@ -2371,7 +1970,7 @@
           <w:i w:val="0"/>
           <w:color w:val="16302B"/>
         </w:rPr>
-        <w:t xml:space="preserve">Sàng lọc an toàn (5 phút đầu): </w:t>
+        <w:t xml:space="preserve">Khảo sát thể trạng an toàn (5 phút đầu): </w:t>
       </w:r>
       <w:r>
         <w:rPr>
@@ -2423,7 +2022,7 @@
           <w:i w:val="0"/>
           <w:color w:val="16302B"/>
         </w:rPr>
-        <w:t>matxa – bấm huyệt – chườm thảo dược theo bài chuẩn 45–70 phút.</w:t>
+        <w:t>massage – bấm huyệt – chườm thảo dược theo bài chuẩn 45–70 phút.</w:t>
       </w:r>
     </w:p>
     <w:p>
@@ -2463,7 +2062,7 @@
         <w:pStyle w:val="Heading1"/>
       </w:pPr>
       <w:r>
-        <w:t>6. Gói dịch vụ và mô hình doanh thu lặp lại</w:t>
+        <w:t>5. Gói dịch vụ và mô hình doanh thu lặp lại</w:t>
       </w:r>
     </w:p>
     <w:p>
@@ -2668,7 +2267,7 @@
                 <w:color w:val="16302B"/>
                 <w:sz w:val="21"/>
               </w:rPr>
-              <w:t>Mix 3 dịch vụ tùy ý; đặt lịch linh hoạt trong 3 tháng; 1 buổi tổng kết liệu trình</w:t>
+              <w:t>Tự chọn kết hợp 3 dịch vụ; đặt lịch linh hoạt trong 3 tháng; 1 buổi tổng kết liệu trình</w:t>
             </w:r>
           </w:p>
         </w:tc>
@@ -2742,7 +2341,7 @@
           <w:color w:val="5C7370"/>
           <w:sz w:val="19"/>
         </w:rPr>
-        <w:t>Bảng 4. Cấp độ gói dịch vụ</w:t>
+        <w:t>Bảng 3. Cấp độ gói dịch vụ</w:t>
       </w:r>
     </w:p>
     <w:p>
@@ -2760,7 +2359,7 @@
         <w:pStyle w:val="Heading1"/>
       </w:pPr>
       <w:r>
-        <w:t>7. Giá trị khác biệt và bối cảnh cạnh tranh</w:t>
+        <w:t>6. Giá trị khác biệt và bối cảnh cạnh tranh</w:t>
       </w:r>
     </w:p>
     <w:tbl>
@@ -2887,7 +2486,7 @@
                 <w:color w:val="FFFFFF"/>
                 <w:sz w:val="21"/>
               </w:rPr>
-              <w:t>Home care rời rạc</w:t>
+              <w:t>Dịch vụ tại nhà tự phát</w:t>
             </w:r>
           </w:p>
         </w:tc>
@@ -3107,7 +2706,7 @@
                 <w:color w:val="16302B"/>
                 <w:sz w:val="21"/>
               </w:rPr>
-              <w:t>Sàng lọc y khoa trước mỗi buổi</w:t>
+              <w:t>Khảo sát thể trạng an toàn trước mỗi buổi</w:t>
             </w:r>
           </w:p>
         </w:tc>
@@ -3502,7 +3101,7 @@
           <w:color w:val="5C7370"/>
           <w:sz w:val="19"/>
         </w:rPr>
-        <w:t>Bảng 5. So sánh với các nhóm dịch vụ hiện có (do nhóm thực hiện trên cơ sở khảo sát dịch vụ công khai tại TP.HCM, 2025–2026)</w:t>
+        <w:t>Bảng 4. So sánh với các nhóm dịch vụ hiện có (do nhóm thực hiện trên cơ sở khảo sát dịch vụ công khai tại TP.HCM, 2025–2026)</w:t>
       </w:r>
     </w:p>
     <w:p>
@@ -3512,7 +3111,7 @@
           <w:i w:val="0"/>
           <w:color w:val="16302B"/>
         </w:rPr>
-        <w:t>Bốn giá trị khác biệt làm nên CareTouch: (1) tiện lợi đúng chỗ — phục vụ tận giường, tận nhà; (2) cổ truyền có kiểm chứng — sàng lọc y khoa là quy trình bắt buộc; (3) giá minh bạch — niêm yết công khai, không phát sinh; (4) sổ sức khỏe cá nhân — liệu trình được theo dõi liên tục thay vì từng buổi rời rạc.</w:t>
+        <w:t>Bốn giá trị khác biệt làm nên CareTouch: (1) tiện lợi đúng chỗ — phục vụ tận giường, tận nhà; (2) cổ truyền có kiểm chứng — khảo sát thể trạng an toàn là quy trình bắt buộc; (3) giá minh bạch — niêm yết công khai, không phát sinh; (4) sổ sức khỏe cá nhân — liệu trình được theo dõi liên tục thay vì từng buổi rời rạc.</w:t>
       </w:r>
     </w:p>
     <w:p>
@@ -3520,7 +3119,7 @@
         <w:pStyle w:val="Heading1"/>
       </w:pPr>
       <w:r>
-        <w:t>8. Nguồn lực, pháp lý và điều kiện vận hành</w:t>
+        <w:t>7. Nguồn lực, pháp lý và điều kiện vận hành</w:t>
       </w:r>
     </w:p>
     <w:p>
@@ -3530,7 +3129,7 @@
           <w:i w:val="0"/>
           <w:color w:val="16302B"/>
         </w:rPr>
-        <w:t>Nhóm xác định rõ ranh giới pháp lý từ đầu: CareTouch định vị là dịch vụ chăm sóc – thư giãn – phục hồi vận động, không phải cơ sở khám chữa bệnh. Cụ thể:</w:t>
+        <w:t>Nhóm xác định rõ ranh giới pháp lý ngay từ đầu: CareTouch định vị là dịch vụ chăm sóc – thư giãn – hỗ trợ vận động, không phải cơ sở khám chữa bệnh. Theo Luật Khám bệnh, chữa bệnh năm 2023 và Nghị định số 96/2023/NĐ-CP hướng dẫn, các hoạt động thuộc phạm vi khám chữa bệnh (kể cả phục hồi chức năng theo nghĩa y khoa) chỉ được thực hiện tại cơ sở đã đăng ký hoạt động. Vì vậy, CareTouch chủ động giới hạn phạm vi dịch vụ để vận hành đúng khung pháp lý, cụ thể:</w:t>
       </w:r>
     </w:p>
     <w:p>
@@ -3544,7 +3143,7 @@
           <w:i w:val="0"/>
           <w:color w:val="16302B"/>
         </w:rPr>
-        <w:t xml:space="preserve">Không khám bệnh, không kê đơn, không quảng cáo chữa bệnh. </w:t>
+        <w:t xml:space="preserve">Không khám bệnh, không kê đơn, không quảng cáo chữa bệnh; không thực hiện các kỹ thuật thuộc phạm vi khám chữa bệnh. </w:t>
       </w:r>
       <w:r>
         <w:rPr>
@@ -3574,7 +3173,7 @@
           <w:i w:val="0"/>
           <w:color w:val="16302B"/>
         </w:rPr>
-        <w:t>theo quy định hiện hành về massage – trị liệu phục hồi chức năng trước khi phục vụ độc lập.</w:t>
+        <w:t>theo quy định hiện hành về massage – xoa bóp trước khi phục vụ độc lập.</w:t>
       </w:r>
     </w:p>
     <w:p>
@@ -3610,7 +3209,7 @@
           <w:i w:val="0"/>
           <w:color w:val="16302B"/>
         </w:rPr>
-        <w:t xml:space="preserve">Sàng lọc bắt buộc: </w:t>
+        <w:t xml:space="preserve">Khảo sát thể trạng bắt buộc: </w:t>
       </w:r>
       <w:r>
         <w:rPr>
@@ -3628,7 +3227,7 @@
           <w:i w:val="0"/>
           <w:color w:val="16302B"/>
         </w:rPr>
-        <w:t>Về nguồn lực, mô hình vận hành với một cơ sở gồm 2 giường trị liệu và 3 kỹ thuật viên phục vụ tại nhà; chi phí đầu tư chủ yếu là cải tạo mặt bằng, dụng cụ trị liệu và quảng bá khai trương — không cần thiết bị đắt tiền nhờ giá trị cốt lõi nằm ở tay nghề và quy trình.</w:t>
+        <w:t>Về nhân sự, giai đoạn đầu mô hình có 6 người tham gia vận hành thường xuyên: 4 kỹ thuật viên có chứng chỉ nghề (2 người phục vụ tại cơ sở hai giường, 2 người đảm nhận các ca tại nhà) và 5 thành viên sáng lập trực tiếp luân phiên đảm nhận công việc điều phối lịch, marketing và chăm sóc khách hàng. Trong giai đoạn kiểm chứng, nhóm sáng lập không rút quỹ lương điều phối mà được ưu tiên chia từ lợi nhuận sau khi hoàn vốn; kỹ thuật viên nhận lương cứng bình quân 8 triệu đồng mỗi tháng, kèm phụ cấp theo từng ca phục vụ tại nhà trích từ phần chênh lệch giá dịch vụ tận nhà. Sang năm thứ hai, khi mở cơ sở thứ hai, dự kiến tuyển thêm một điều phối viên toàn thời gian. Chi phí đầu tư chủ yếu là cải tạo mặt bằng, dụng cụ trị liệu và quảng bá khai trương — mô hình không cần thiết bị đắt tiền vì giá trị cốt lõi nằm ở tay nghề và quy trình.</w:t>
       </w:r>
     </w:p>
     <w:p>
@@ -3636,7 +3235,7 @@
         <w:pStyle w:val="Heading1"/>
       </w:pPr>
       <w:r>
-        <w:t>9. Marketing và kênh tiếp cận khách hàng</w:t>
+        <w:t>8. Marketing và kênh tiếp cận khách hàng</w:t>
       </w:r>
     </w:p>
     <w:p>
@@ -3730,7 +3329,7 @@
         <w:pStyle w:val="Heading1"/>
       </w:pPr>
       <w:r>
-        <w:t>10. Tài chính dự phóng</w:t>
+        <w:t>9. Tài chính dự phóng</w:t>
       </w:r>
     </w:p>
     <w:p>
@@ -3740,7 +3339,7 @@
           <w:i w:val="0"/>
           <w:color w:val="16302B"/>
         </w:rPr>
-        <w:t>Toàn bộ số liệu trong chương này là giả định minh họa phục vụ mục đích học tập, dựng trên mô hình vận hành: một cơ sở 2 giường trị liệu + 3 kỹ thuật viên phục vụ tại nhà; giá bán theo Bảng 3. Các con số sẽ được thay bằng khảo sát địa bàn thực tế khi triển khai.</w:t>
+        <w:t>Toàn bộ số liệu trong chương này là giả định minh họa phục vụ mục đích học tập, dựng trên mô hình vận hành: một cơ sở 2 giường trị liệu với 4 kỹ thuật viên (2 người tại cơ sở, 2 người đảm nhận ca tại nhà); giá bán theo Bảng 2. Các con số sẽ được thay bằng khảo sát địa bàn thực tế khi triển khai.</w:t>
       </w:r>
     </w:p>
     <w:tbl>
@@ -3766,7 +3365,7 @@
       <w:tr>
         <w:tc>
           <w:tcPr>
-            <w:tcW w:type="dxa" w:w="2268"/>
+            <w:tcW w:type="dxa" w:w="2381"/>
             <w:shd w:val="clear" w:color="auto" w:fill="0E7C6B"/>
           </w:tcPr>
           <w:p>
@@ -3786,7 +3385,7 @@
         </w:tc>
         <w:tc>
           <w:tcPr>
-            <w:tcW w:type="dxa" w:w="2494"/>
+            <w:tcW w:type="dxa" w:w="2381"/>
             <w:shd w:val="clear" w:color="auto" w:fill="0E7C6B"/>
           </w:tcPr>
           <w:p>
@@ -3828,7 +3427,7 @@
       <w:tr>
         <w:tc>
           <w:tcPr>
-            <w:tcW w:type="dxa" w:w="2268"/>
+            <w:tcW w:type="dxa" w:w="2381"/>
           </w:tcPr>
           <w:p>
             <w:pPr>
@@ -3846,7 +3445,7 @@
         </w:tc>
         <w:tc>
           <w:tcPr>
-            <w:tcW w:type="dxa" w:w="2494"/>
+            <w:tcW w:type="dxa" w:w="2381"/>
           </w:tcPr>
           <w:p>
             <w:pPr>
@@ -3884,7 +3483,122 @@
       <w:tr>
         <w:tc>
           <w:tcPr>
-            <w:tcW w:type="dxa" w:w="2268"/>
+            <w:tcW w:type="dxa" w:w="2381"/>
+            <w:shd w:val="clear" w:color="auto" w:fill="F4FAF8"/>
+          </w:tcPr>
+          <w:p>
+            <w:pPr>
+              <w:spacing w:after="40" w:before="40"/>
+            </w:pPr>
+            <w:r>
+              <w:rPr>
+                <w:rFonts w:ascii="Segoe UI" w:hAnsi="Segoe UI"/>
+                <w:color w:val="16302B"/>
+                <w:sz w:val="21"/>
+              </w:rPr>
+              <w:t>Vốn lưu động bù lỗ (tháng 1–4)</w:t>
+            </w:r>
+          </w:p>
+        </w:tc>
+        <w:tc>
+          <w:tcPr>
+            <w:tcW w:type="dxa" w:w="2381"/>
+            <w:shd w:val="clear" w:color="auto" w:fill="F4FAF8"/>
+          </w:tcPr>
+          <w:p>
+            <w:pPr>
+              <w:spacing w:after="40" w:before="40"/>
+            </w:pPr>
+            <w:r>
+              <w:rPr>
+                <w:rFonts w:ascii="Segoe UI" w:hAnsi="Segoe UI"/>
+                <w:color w:val="16302B"/>
+                <w:sz w:val="21"/>
+              </w:rPr>
+              <w:t>~70 triệu đồng</w:t>
+            </w:r>
+          </w:p>
+        </w:tc>
+        <w:tc>
+          <w:tcPr>
+            <w:tcW w:type="dxa" w:w="4195"/>
+            <w:shd w:val="clear" w:color="auto" w:fill="F4FAF8"/>
+          </w:tcPr>
+          <w:p>
+            <w:pPr>
+              <w:spacing w:after="40" w:before="40"/>
+            </w:pPr>
+            <w:r>
+              <w:rPr>
+                <w:rFonts w:ascii="Segoe UI" w:hAnsi="Segoe UI"/>
+                <w:color w:val="16302B"/>
+                <w:sz w:val="21"/>
+              </w:rPr>
+              <w:t>Lỗ lũy kế 4 tháng đầu: 26 + 18 + 10 + 4 = 58 triệu đồng; dự trù thêm 12 triệu đồng làm đệm an toàn</w:t>
+            </w:r>
+          </w:p>
+        </w:tc>
+      </w:tr>
+      <w:tr>
+        <w:tc>
+          <w:tcPr>
+            <w:tcW w:type="dxa" w:w="2381"/>
+          </w:tcPr>
+          <w:p>
+            <w:pPr>
+              <w:spacing w:after="40" w:before="40"/>
+            </w:pPr>
+            <w:r>
+              <w:rPr>
+                <w:rFonts w:ascii="Segoe UI" w:hAnsi="Segoe UI"/>
+                <w:color w:val="16302B"/>
+                <w:sz w:val="21"/>
+              </w:rPr>
+              <w:t>Tổng nhu cầu vốn khởi đầu</w:t>
+            </w:r>
+          </w:p>
+        </w:tc>
+        <w:tc>
+          <w:tcPr>
+            <w:tcW w:type="dxa" w:w="2381"/>
+          </w:tcPr>
+          <w:p>
+            <w:pPr>
+              <w:spacing w:after="40" w:before="40"/>
+            </w:pPr>
+            <w:r>
+              <w:rPr>
+                <w:rFonts w:ascii="Segoe UI" w:hAnsi="Segoe UI"/>
+                <w:color w:val="16302B"/>
+                <w:sz w:val="21"/>
+              </w:rPr>
+              <w:t>~165 triệu đồng</w:t>
+            </w:r>
+          </w:p>
+        </w:tc>
+        <w:tc>
+          <w:tcPr>
+            <w:tcW w:type="dxa" w:w="4195"/>
+          </w:tcPr>
+          <w:p>
+            <w:pPr>
+              <w:spacing w:after="40" w:before="40"/>
+            </w:pPr>
+            <w:r>
+              <w:rPr>
+                <w:rFonts w:ascii="Segoe UI" w:hAnsi="Segoe UI"/>
+                <w:color w:val="16302B"/>
+                <w:sz w:val="21"/>
+              </w:rPr>
+              <w:t>95 triệu đồng đầu tư + 70 triệu đồng vốn lưu động</w:t>
+            </w:r>
+          </w:p>
+        </w:tc>
+      </w:tr>
+      <w:tr>
+        <w:tc>
+          <w:tcPr>
+            <w:tcW w:type="dxa" w:w="2381"/>
             <w:shd w:val="clear" w:color="auto" w:fill="F4FAF8"/>
           </w:tcPr>
           <w:p>
@@ -3903,7 +3617,7 @@
         </w:tc>
         <w:tc>
           <w:tcPr>
-            <w:tcW w:type="dxa" w:w="2494"/>
+            <w:tcW w:type="dxa" w:w="2381"/>
             <w:shd w:val="clear" w:color="auto" w:fill="F4FAF8"/>
           </w:tcPr>
           <w:p>
@@ -3935,7 +3649,7 @@
                 <w:color w:val="16302B"/>
                 <w:sz w:val="21"/>
               </w:rPr>
-              <w:t>Thuê mặt bằng 12 triệu; lương 4 người ~32 triệu; điện nước, vật tư, khấu hao còn lại</w:t>
+              <w:t>Thuê mặt bằng 12 triệu; lương 4 kỹ thuật viên ~32 triệu (lương cứng ~8 triệu/người, kèm phụ cấp ca tại nhà); điện nước, vật tư, khấu hao còn lại</w:t>
             </w:r>
           </w:p>
         </w:tc>
@@ -3943,7 +3657,7 @@
       <w:tr>
         <w:tc>
           <w:tcPr>
-            <w:tcW w:type="dxa" w:w="2268"/>
+            <w:tcW w:type="dxa" w:w="2381"/>
           </w:tcPr>
           <w:p>
             <w:pPr>
@@ -3961,7 +3675,7 @@
         </w:tc>
         <w:tc>
           <w:tcPr>
-            <w:tcW w:type="dxa" w:w="2494"/>
+            <w:tcW w:type="dxa" w:w="2381"/>
           </w:tcPr>
           <w:p>
             <w:pPr>
@@ -3996,65 +3710,6 @@
           </w:p>
         </w:tc>
       </w:tr>
-      <w:tr>
-        <w:tc>
-          <w:tcPr>
-            <w:tcW w:type="dxa" w:w="2268"/>
-            <w:shd w:val="clear" w:color="auto" w:fill="F4FAF8"/>
-          </w:tcPr>
-          <w:p>
-            <w:pPr>
-              <w:spacing w:after="40" w:before="40"/>
-            </w:pPr>
-            <w:r>
-              <w:rPr>
-                <w:rFonts w:ascii="Segoe UI" w:hAnsi="Segoe UI"/>
-                <w:color w:val="16302B"/>
-                <w:sz w:val="21"/>
-              </w:rPr>
-              <w:t>Điểm hòa vốn – hoàn vốn</w:t>
-            </w:r>
-          </w:p>
-        </w:tc>
-        <w:tc>
-          <w:tcPr>
-            <w:tcW w:type="dxa" w:w="2494"/>
-            <w:shd w:val="clear" w:color="auto" w:fill="F4FAF8"/>
-          </w:tcPr>
-          <w:p>
-            <w:pPr>
-              <w:spacing w:after="40" w:before="40"/>
-            </w:pPr>
-            <w:r>
-              <w:rPr>
-                <w:rFonts w:ascii="Segoe UI" w:hAnsi="Segoe UI"/>
-                <w:color w:val="16302B"/>
-                <w:sz w:val="21"/>
-              </w:rPr>
-              <w:t>Tháng thứ 5 – 12–14 tháng</w:t>
-            </w:r>
-          </w:p>
-        </w:tc>
-        <w:tc>
-          <w:tcPr>
-            <w:tcW w:type="dxa" w:w="4195"/>
-            <w:shd w:val="clear" w:color="auto" w:fill="F4FAF8"/>
-          </w:tcPr>
-          <w:p>
-            <w:pPr>
-              <w:spacing w:after="40" w:before="40"/>
-            </w:pPr>
-            <w:r>
-              <w:rPr>
-                <w:rFonts w:ascii="Segoe UI" w:hAnsi="Segoe UI"/>
-                <w:color w:val="16302B"/>
-                <w:sz w:val="21"/>
-              </w:rPr>
-              <w:t>Hoàn vốn đúng hạn nếu tỷ lệ khách quay lại từ 55% trở lên</w:t>
-            </w:r>
-          </w:p>
-        </w:tc>
-      </w:tr>
     </w:tbl>
     <w:p>
       <w:pPr>
@@ -4068,7 +3723,7 @@
           <w:color w:val="5C7370"/>
           <w:sz w:val="19"/>
         </w:rPr>
-        <w:t>Bảng 6. Các giả định tài chính chính</w:t>
+        <w:t>Bảng 5. Các giả định tài chính chính</w:t>
       </w:r>
     </w:p>
     <w:p>
@@ -4133,7 +3788,27 @@
           <w:i w:val="0"/>
           <w:color w:val="16302B"/>
         </w:rPr>
-        <w:t>Điểm nghẽn đầu tiên của mô hình là công suất nhân sự: một kỹ thuật viên chỉ phục vụ được 5–6 khách mỗi ngày. Vì vậy doanh thu tháng 12 (88 triệu đồng) đã gần chạm trần công suất của 3 kỹ thuật viên; bước tăng trưởng tiếp theo phải đến từ tuyển thêm nhân sự hoặc mở cơ sở thứ hai — đây chính là lý do của lộ trình mở rộng ở chương 12.</w:t>
+        <w:t>Phép tính vốn lưu động: trong bốn tháng đầu, doanh thu còn thấp hơn chi phí cố định nên dự án lỗ 26 triệu đồng vào tháng 1, 18 triệu đồng vào tháng 2, 10 triệu đồng vào tháng 3 và 4 triệu đồng vào tháng 4; cộng lại, lỗ lũy kế bốn tháng đầu là 58 triệu đồng. Nếu chỉ có 95 triệu đồng đầu tư ban đầu, dòng tiền của dự án sẽ âm ngay từ tháng thứ hai. Vì vậy, nhu cầu vốn khởi đầu gồm 95 triệu đồng đầu tư cộng tối thiểu 58 triệu đồng vốn lưu động, được nhóm dự trù lên 70 triệu đồng để có đệm an toàn; tổng nhu cầu vốn khởi đầu là 165 triệu đồng.</w:t>
+      </w:r>
+    </w:p>
+    <w:p>
+      <w:r>
+        <w:rPr>
+          <w:b w:val="0"/>
+          <w:i w:val="0"/>
+          <w:color w:val="16302B"/>
+        </w:rPr>
+        <w:t>Phép tính hoàn vốn: kể từ tháng thứ năm, lãi ròng hàng tháng lần lượt là 2, 8, 14, 20, 25, 30, 35 và 40 triệu đồng (doanh thu trừ chi phí cố định 48 triệu đồng); lũy kế từ tháng 5 đến tháng 12 đạt 174 triệu đồng, lớn hơn tổng vốn 165 triệu đồng — tức toàn bộ vốn được thu hồi trong khoảng 12 tháng. Riêng phần đầu tư ban đầu 95 triệu đồng được thu hồi vào khoảng tháng thứ 10, khi lũy kế lãi ròng đạt 99 triệu đồng. Nếu tỷ lệ khách quay lại chỉ đạt ngưỡng 55%, hoàn vốn sẽ trôi về khoảng 12–14 tháng theo kịch bản thận trọng.</w:t>
+      </w:r>
+    </w:p>
+    <w:p>
+      <w:r>
+        <w:rPr>
+          <w:b w:val="0"/>
+          <w:i w:val="0"/>
+          <w:color w:val="16302B"/>
+        </w:rPr>
+        <w:t>Điểm nghẽn đầu tiên của mô hình là công suất nhân sự. Một kỹ thuật viên phục vụ được 5–6 khách tại cơ sở hoặc tối đa 4 ca tại nhà mỗi ngày (mỗi ca tại nhà chiếm 1,5–2 tiếng); bốn kỹ thuật viên cho công suất tối đa khoảng 20 lượt mỗi ngày, tương đương 450–500 lượt mỗi tháng với 26 ngày hoạt động. Doanh thu tháng thứ 12, tương đương khoảng 350 khách, đã sử dụng 70–80% công suất này; vì vậy bước tăng trưởng tiếp theo phải đến từ tuyển thêm nhân sự hoặc mở cơ sở thứ hai — đây chính là lý do của lộ trình mở rộng ở chương 11.</w:t>
       </w:r>
     </w:p>
     <w:p>
@@ -4141,7 +3816,7 @@
         <w:pStyle w:val="Heading1"/>
       </w:pPr>
       <w:r>
-        <w:t>11. Rủi ro và phương án hóa giải</w:t>
+        <w:t>10. Rủi ro và giải pháp ứng phó</w:t>
       </w:r>
     </w:p>
     <w:tbl>
@@ -4221,7 +3896,7 @@
                 <w:color w:val="FFFFFF"/>
                 <w:sz w:val="21"/>
               </w:rPr>
-              <w:t>Cách hóa giải</w:t>
+              <w:t>Giải pháp ứng phó</w:t>
             </w:r>
           </w:p>
         </w:tc>
@@ -4241,7 +3916,7 @@
                 <w:color w:val="16302B"/>
                 <w:sz w:val="21"/>
               </w:rPr>
-              <w:t>Pháp lý và ranh giới với “khám chữa bệnh”</w:t>
+              <w:t>Ranh giới pháp lý với “khám chữa bệnh”</w:t>
             </w:r>
           </w:p>
         </w:tc>
@@ -4277,7 +3952,7 @@
                 <w:color w:val="16302B"/>
                 <w:sz w:val="21"/>
               </w:rPr>
-              <w:t>Định vị dịch vụ chăm sóc – thư giãn – phục hồi vận động; không khám bệnh, không kê thuốc, không quảng cáo chữa bệnh; bác sĩ y học cổ truyền cộng tác đảm nhận chuyên môn; kỹ thuật viên thi chứng chỉ nghề</w:t>
+              <w:t>Định vị dịch vụ chăm sóc – thư giãn – hỗ trợ vận động; không khám bệnh, không kê thuốc, không thực hiện kỹ thuật thuộc phạm vi khám chữa bệnh (Luật Khám bệnh, chữa bệnh 2023; Nghị định 96/2023/NĐ-CP); bác sĩ y học cổ truyền cộng tác đảm nhận chuyên môn; kỹ thuật viên thi chứng chỉ nghề</w:t>
             </w:r>
           </w:p>
         </w:tc>
@@ -4336,7 +4011,7 @@
                 <w:color w:val="16302B"/>
                 <w:sz w:val="21"/>
               </w:rPr>
-              <w:t>Sàng lọc bắt buộc buổi đầu (hỏi bệnh nền, đo huyết áp); từ chối hoặc khuyên đi khám khi có chống chỉ định; mua bảo hiểm trách nhiệm dịch vụ</w:t>
+              <w:t>Khảo sát bắt buộc buổi đầu (hỏi bệnh nền, đo huyết áp); từ chối hoặc khuyên đi khám khi có chống chỉ định; mua bảo hiểm trách nhiệm dịch vụ</w:t>
             </w:r>
           </w:p>
         </w:tc>
@@ -4469,7 +4144,7 @@
           <w:color w:val="5C7370"/>
           <w:sz w:val="19"/>
         </w:rPr>
-        <w:t>Bảng 7. Danh mục rủi ro và phương án hóa giải</w:t>
+        <w:t>Bảng 6. Danh mục rủi ro và giải pháp ứng phó</w:t>
       </w:r>
     </w:p>
     <w:p>
@@ -4477,7 +4152,7 @@
         <w:pStyle w:val="Heading1"/>
       </w:pPr>
       <w:r>
-        <w:t>12. Lộ trình triển khai</w:t>
+        <w:t>11. Lộ trình triển khai</w:t>
       </w:r>
     </w:p>
     <w:p>
@@ -4499,7 +4174,7 @@
           <w:i w:val="0"/>
           <w:color w:val="16302B"/>
         </w:rPr>
-        <w:t>vận hành cơ sở đầu tiên, chuẩn hóa quy trình sàng lọc và đào tạo, đo tỷ lệ khách quay lại từ tháng đầu.</w:t>
+        <w:t>vận hành cơ sở đầu tiên, chuẩn hóa quy trình khảo sát thể trạng và đào tạo, đo tỷ lệ khách quay lại từ tháng đầu.</w:t>
       </w:r>
     </w:p>
     <w:p>
@@ -4583,7 +4258,7 @@
         <w:pStyle w:val="Heading1"/>
       </w:pPr>
       <w:r>
-        <w:t>13. Kết luận và khuyến nghị</w:t>
+        <w:t>12. Kết luận và khuyến nghị</w:t>
       </w:r>
     </w:p>
     <w:p>
@@ -4603,7 +4278,7 @@
           <w:i w:val="0"/>
           <w:color w:val="16302B"/>
         </w:rPr>
-        <w:t>Khuyến nghị của nhóm: bắt đầu với quy mô nhỏ để kiểm chứng quy trình — mở buổi trị liệu đầu tiên, phục vụ thật tốt nhóm khách đầu tiên, đo tỷ lệ quay lại từ tháng đầu; hoàn thiện hồ sơ pháp lý và quy trình sàng lọc an toàn trước khi mở rộng. Mục tiêu năm đầu tiên là tỷ lệ khách quay lại từ 55% trở lên và doanh thu 88 triệu đồng/tháng vào tháng thứ 12 theo dự phóng. Với khoản vốn gọi đề xuất minh họa 500 triệu đồng, nhóm dự kiến mở rộng lên 2 cơ sở kèm nền tảng đặt lịch Zalo Mini App trong năm thứ hai.</w:t>
+        <w:t>Khuyến nghị của nhóm: bắt đầu với quy mô nhỏ để kiểm chứng quy trình — mở buổi trị liệu đầu tiên, phục vụ thật tốt nhóm khách đầu tiên, đo tỷ lệ quay lại từ tháng đầu; hoàn thiện hồ sơ pháp lý và quy trình khảo sát thể trạng an toàn trước khi mở rộng. Mục tiêu năm đầu tiên là tỷ lệ khách quay lại từ 55% trở lên và doanh thu 88 triệu đồng/tháng vào tháng thứ 12 theo dự phóng. Tổng nhu cầu vốn khởi đầu 165 triệu đồng được thiết kế để dự án an toàn về dòng tiền trong suốt giai đoạn kiểm chứng. Với khoản vốn gọi đề xuất minh họa 500 triệu đồng, nhóm dự kiến mở rộng lên 2 cơ sở kèm nền tảng đặt lịch Zalo Mini App trong năm thứ hai.</w:t>
       </w:r>
     </w:p>
     <w:p>
@@ -4923,6 +4598,39 @@
       </w:hyperlink>
     </w:p>
     <w:p>
+      <w:pPr>
+        <w:spacing w:after="100"/>
+      </w:pPr>
+      <w:r>
+        <w:rPr>
+          <w:b/>
+          <w:i w:val="0"/>
+          <w:color w:val="5C7370"/>
+        </w:rPr>
+        <w:t xml:space="preserve">[10] </w:t>
+      </w:r>
+      <w:r>
+        <w:rPr>
+          <w:b w:val="0"/>
+          <w:i w:val="0"/>
+          <w:color w:val="16302B"/>
+          <w:sz w:val="21"/>
+        </w:rPr>
+        <w:t xml:space="preserve">Luật Khám bệnh, chữa bệnh năm 2023 và Nghị định 96/2023/NĐ-CP hướng dẫn Luật Khám bệnh, chữa bệnh (tra cứu tại Cổng thông tin điện tử Chính phủ). </w:t>
+      </w:r>
+      <w:hyperlink r:id="rId22">
+        <w:r>
+          <w:rPr>
+            <w:rFonts w:ascii="Segoe UI" w:hAnsi="Segoe UI" w:cs="Segoe UI"/>
+            <w:color w:val="0E7C6B"/>
+            <w:u w:val="single"/>
+            <w:sz w:val="20"/>
+          </w:rPr>
+          <w:t xml:space="preserve">https://vanban.chinhphu.vn/</w:t>
+        </w:r>
+      </w:hyperlink>
+    </w:p>
+    <w:p>
       <w:r>
         <w:rPr>
           <w:b w:val="0"/>
@@ -4948,7 +4656,7 @@
           <w:i w:val="0"/>
           <w:color w:val="16302B"/>
         </w:rPr>
-        <w:t>Nhóm đã sinh 5 ý tưởng ban đầu quanh vấn đề “chăm sóc sức khỏe chủ động, tiện lợi cho người già”: hỗ trợ đi khám bệnh; khám sức khỏe định kỳ tại nhà; thiết bị nhắc uống thuốc; matxa – trị liệu phục hồi – đả thông kinh lạc (cổ truyền); và dịch vụ nấu ăn chế độ cho người già. Ba ý tưởng khả thi nhất được đưa vào bảng đánh giá 5 tiêu chí, thang điểm 5:</w:t>
+        <w:t>Nhóm đã sinh 5 ý tưởng ban đầu quanh vấn đề “chăm sóc sức khỏe chủ động, tiện lợi cho người già”: hỗ trợ đi khám bệnh; khám sức khỏe định kỳ tại nhà; thiết bị nhắc uống thuốc; massage – xoa bóp, bấm huyệt và đả thông kinh lạc theo cổ truyền; và dịch vụ nấu ăn chế độ cho người già. Ba ý tưởng khả thi nhất được đưa vào bảng đánh giá 5 tiêu chí, thang điểm 5:</w:t>
       </w:r>
     </w:p>
     <w:tbl>
@@ -5544,7 +5252,7 @@
           <w:color w:val="5C7370"/>
           <w:sz w:val="19"/>
         </w:rPr>
-        <w:t>Bảng 8. Bảng đánh giá và so sánh 3 ý tưởng (thang điểm 5)</w:t>
+        <w:t>Bảng 7. Bảng đánh giá và so sánh 3 ý tưởng (thang điểm 5)</w:t>
       </w:r>
     </w:p>
     <w:p>
@@ -5555,6 +5263,404 @@
           <w:color w:val="16302B"/>
         </w:rPr>
         <w:t>Ý tưởng 3 đạt điểm cao nhất trên tổng thể và được chọn, với ba lý do chính: xu hướng chăm sóc sức khỏe chủ động giúp y học cổ truyền ngày càng được ưa chuộng nhờ an toàn, không dùng thuốc; mô hình dịch vụ có biên lợi nhuận tốt và doanh thu ổn định nhờ khách hàng dùng theo liệu trình 5–10 buổi; và rào cản chứng chỉ hành nghề cùng yếu tố chuyên môn chuẩn y khoa tạo lợi thế khác biệt bền vững so với các spa thư giãn thông thường.</w:t>
+      </w:r>
+    </w:p>
+    <w:p>
+      <w:pPr>
+        <w:pStyle w:val="Heading1"/>
+      </w:pPr>
+      <w:r>
+        <w:t>Phụ lục B. Ghi chú đổi thương hiệu: từ An Khang Đường đến CareTouch</w:t>
+      </w:r>
+    </w:p>
+    <w:p>
+      <w:r>
+        <w:rPr>
+          <w:b w:val="0"/>
+          <w:i w:val="0"/>
+          <w:color w:val="16302B"/>
+        </w:rPr>
+        <w:t>Tên ban đầu “An Khang Đường” mang ý nghĩa tốt đẹp — “An Khang” là mong ước sức khỏe bình an, “Đường” theo cách đặt tên các nhà thuốc, cơ sở y học cổ truyền xưa. Tuy nhiên, khi dự án bước vào giai đoạn chuẩn bị gọi vốn và mở rộng, nhóm nhận thấy tên gọi này bộc lộ ba hạn chế: khó phát âm với đối tác quốc tế và khách hàng trẻ; dài, khó nhớ trên các kênh số như Zalo, Facebook hay ứng dụng đặt lịch; và hình ảnh “cửa hàng thuốc cổ” dễ khiến khách hàng nhầm lẫn về phạm vi dịch vụ.</w:t>
+      </w:r>
+    </w:p>
+    <w:p>
+      <w:r>
+        <w:rPr>
+          <w:b w:val="0"/>
+          <w:i w:val="0"/>
+          <w:color w:val="16302B"/>
+        </w:rPr>
+        <w:t xml:space="preserve">Sau khi đánh giá nhiều phương án, nhóm chọn tên </w:t>
+      </w:r>
+      <w:r>
+        <w:rPr>
+          <w:b/>
+          <w:i w:val="0"/>
+          <w:color w:val="E8590C"/>
+        </w:rPr>
+        <w:t>CareTouch</w:t>
+      </w:r>
+      <w:r>
+        <w:rPr>
+          <w:b w:val="0"/>
+          <w:i w:val="0"/>
+          <w:color w:val="16302B"/>
+        </w:rPr>
+        <w:t xml:space="preserve"> — ghép hai chữ “Care” (sự chăm sóc chu đáo) và “Touch” (cái chạm trị liệu). Tên gọi nói đúng bản chất dịch vụ: hỗ trợ thư giãn, giảm mỏi cơ khớp bằng đôi tay, đồng thời gợi cảm giác tận tâm. Slogan kèm theo: </w:t>
+      </w:r>
+      <w:r>
+        <w:rPr>
+          <w:b/>
+          <w:i/>
+          <w:color w:val="16302B"/>
+        </w:rPr>
+        <w:t>“CareTouch – Healing Touch, Healthy Life”</w:t>
+      </w:r>
+      <w:r>
+        <w:rPr>
+          <w:b w:val="0"/>
+          <w:i w:val="0"/>
+          <w:color w:val="16302B"/>
+        </w:rPr>
+        <w:t xml:space="preserve"> (Chạm trị liệu — Sống khỏe mỗi ngày).</w:t>
+      </w:r>
+    </w:p>
+    <w:p>
+      <w:r>
+        <w:rPr>
+          <w:b w:val="0"/>
+          <w:i w:val="0"/>
+          <w:color w:val="16302B"/>
+        </w:rPr>
+        <w:t>Bảng dưới đây tóm tắt lý do đổi tên:</w:t>
+      </w:r>
+    </w:p>
+    <w:tbl>
+      <w:tblPr>
+        <w:tblStyle w:val="TableGrid"/>
+        <w:tblW w:type="auto" w:w="0"/>
+        <w:jc w:val="center"/>
+        <w:tblLook w:firstColumn="1" w:firstRow="1" w:lastColumn="0" w:lastRow="0" w:noHBand="0" w:noVBand="1" w:val="04A0"/>
+        <w:tblBorders>
+          <w:top w:val="single" w:sz="4" w:color="DCEBE6"/>
+          <w:left w:val="single" w:sz="4" w:color="DCEBE6"/>
+          <w:bottom w:val="single" w:sz="4" w:color="DCEBE6"/>
+          <w:right w:val="single" w:sz="4" w:color="DCEBE6"/>
+          <w:insideH w:val="single" w:sz="4" w:color="DCEBE6"/>
+          <w:insideV w:val="single" w:sz="4" w:color="DCEBE6"/>
+        </w:tblBorders>
+      </w:tblPr>
+      <w:tblGrid>
+        <w:gridCol w:w="3061"/>
+        <w:gridCol w:w="3061"/>
+        <w:gridCol w:w="3061"/>
+      </w:tblGrid>
+      <w:tr>
+        <w:tc>
+          <w:tcPr>
+            <w:tcW w:type="dxa" w:w="2041"/>
+            <w:shd w:val="clear" w:color="auto" w:fill="0E7C6B"/>
+          </w:tcPr>
+          <w:p>
+            <w:pPr>
+              <w:spacing w:after="40" w:before="40"/>
+            </w:pPr>
+            <w:r>
+              <w:rPr>
+                <w:rFonts w:ascii="Segoe UI" w:hAnsi="Segoe UI"/>
+                <w:b/>
+                <w:color w:val="FFFFFF"/>
+                <w:sz w:val="21"/>
+              </w:rPr>
+              <w:t>Tiêu chí</w:t>
+            </w:r>
+          </w:p>
+        </w:tc>
+        <w:tc>
+          <w:tcPr>
+            <w:tcW w:type="dxa" w:w="3175"/>
+            <w:shd w:val="clear" w:color="auto" w:fill="0E7C6B"/>
+          </w:tcPr>
+          <w:p>
+            <w:pPr>
+              <w:spacing w:after="40" w:before="40"/>
+            </w:pPr>
+            <w:r>
+              <w:rPr>
+                <w:rFonts w:ascii="Segoe UI" w:hAnsi="Segoe UI"/>
+                <w:b/>
+                <w:color w:val="FFFFFF"/>
+                <w:sz w:val="21"/>
+              </w:rPr>
+              <w:t>An Khang Đường</w:t>
+            </w:r>
+          </w:p>
+        </w:tc>
+        <w:tc>
+          <w:tcPr>
+            <w:tcW w:type="dxa" w:w="3742"/>
+            <w:shd w:val="clear" w:color="auto" w:fill="0E7C6B"/>
+          </w:tcPr>
+          <w:p>
+            <w:pPr>
+              <w:spacing w:after="40" w:before="40"/>
+            </w:pPr>
+            <w:r>
+              <w:rPr>
+                <w:rFonts w:ascii="Segoe UI" w:hAnsi="Segoe UI"/>
+                <w:b/>
+                <w:color w:val="FFFFFF"/>
+                <w:sz w:val="21"/>
+              </w:rPr>
+              <w:t>CareTouch</w:t>
+            </w:r>
+          </w:p>
+        </w:tc>
+      </w:tr>
+      <w:tr>
+        <w:tc>
+          <w:tcPr>
+            <w:tcW w:type="dxa" w:w="2041"/>
+          </w:tcPr>
+          <w:p>
+            <w:pPr>
+              <w:spacing w:after="40" w:before="40"/>
+            </w:pPr>
+            <w:r>
+              <w:rPr>
+                <w:rFonts w:ascii="Segoe UI" w:hAnsi="Segoe UI"/>
+                <w:color w:val="16302B"/>
+                <w:sz w:val="21"/>
+              </w:rPr>
+              <w:t>Khả năng ghi nhớ</w:t>
+            </w:r>
+          </w:p>
+        </w:tc>
+        <w:tc>
+          <w:tcPr>
+            <w:tcW w:type="dxa" w:w="3175"/>
+          </w:tcPr>
+          <w:p>
+            <w:pPr>
+              <w:spacing w:after="40" w:before="40"/>
+            </w:pPr>
+            <w:r>
+              <w:rPr>
+                <w:rFonts w:ascii="Segoe UI" w:hAnsi="Segoe UI"/>
+                <w:color w:val="16302B"/>
+                <w:sz w:val="21"/>
+              </w:rPr>
+              <w:t>Dài, dễ nhầm với nhà thuốc</w:t>
+            </w:r>
+          </w:p>
+        </w:tc>
+        <w:tc>
+          <w:tcPr>
+            <w:tcW w:type="dxa" w:w="3742"/>
+          </w:tcPr>
+          <w:p>
+            <w:pPr>
+              <w:spacing w:after="40" w:before="40"/>
+            </w:pPr>
+            <w:r>
+              <w:rPr>
+                <w:rFonts w:ascii="Segoe UI" w:hAnsi="Segoe UI"/>
+                <w:color w:val="16302B"/>
+                <w:sz w:val="21"/>
+              </w:rPr>
+              <w:t>Hai âm tiết, đọc đúng ngay lần đầu</w:t>
+            </w:r>
+          </w:p>
+        </w:tc>
+      </w:tr>
+      <w:tr>
+        <w:tc>
+          <w:tcPr>
+            <w:tcW w:type="dxa" w:w="2041"/>
+            <w:shd w:val="clear" w:color="auto" w:fill="F4FAF8"/>
+          </w:tcPr>
+          <w:p>
+            <w:pPr>
+              <w:spacing w:after="40" w:before="40"/>
+            </w:pPr>
+            <w:r>
+              <w:rPr>
+                <w:rFonts w:ascii="Segoe UI" w:hAnsi="Segoe UI"/>
+                <w:color w:val="16302B"/>
+                <w:sz w:val="21"/>
+              </w:rPr>
+              <w:t>Khách hàng quốc tế</w:t>
+            </w:r>
+          </w:p>
+        </w:tc>
+        <w:tc>
+          <w:tcPr>
+            <w:tcW w:type="dxa" w:w="3175"/>
+            <w:shd w:val="clear" w:color="auto" w:fill="F4FAF8"/>
+          </w:tcPr>
+          <w:p>
+            <w:pPr>
+              <w:spacing w:after="40" w:before="40"/>
+            </w:pPr>
+            <w:r>
+              <w:rPr>
+                <w:rFonts w:ascii="Segoe UI" w:hAnsi="Segoe UI"/>
+                <w:color w:val="16302B"/>
+                <w:sz w:val="21"/>
+              </w:rPr>
+              <w:t>Khó phát âm, khó viết</w:t>
+            </w:r>
+          </w:p>
+        </w:tc>
+        <w:tc>
+          <w:tcPr>
+            <w:tcW w:type="dxa" w:w="3742"/>
+            <w:shd w:val="clear" w:color="auto" w:fill="F4FAF8"/>
+          </w:tcPr>
+          <w:p>
+            <w:pPr>
+              <w:spacing w:after="40" w:before="40"/>
+            </w:pPr>
+            <w:r>
+              <w:rPr>
+                <w:rFonts w:ascii="Segoe UI" w:hAnsi="Segoe UI"/>
+                <w:color w:val="16302B"/>
+                <w:sz w:val="21"/>
+              </w:rPr>
+              <w:t>Tiếng Anh đơn giản, phù hợp khách du lịch chăm sóc sức khỏe</w:t>
+            </w:r>
+          </w:p>
+        </w:tc>
+      </w:tr>
+      <w:tr>
+        <w:tc>
+          <w:tcPr>
+            <w:tcW w:type="dxa" w:w="2041"/>
+          </w:tcPr>
+          <w:p>
+            <w:pPr>
+              <w:spacing w:after="40" w:before="40"/>
+            </w:pPr>
+            <w:r>
+              <w:rPr>
+                <w:rFonts w:ascii="Segoe UI" w:hAnsi="Segoe UI"/>
+                <w:color w:val="16302B"/>
+                <w:sz w:val="21"/>
+              </w:rPr>
+              <w:t>Hình ảnh số</w:t>
+            </w:r>
+          </w:p>
+        </w:tc>
+        <w:tc>
+          <w:tcPr>
+            <w:tcW w:type="dxa" w:w="3175"/>
+          </w:tcPr>
+          <w:p>
+            <w:pPr>
+              <w:spacing w:after="40" w:before="40"/>
+            </w:pPr>
+            <w:r>
+              <w:rPr>
+                <w:rFonts w:ascii="Segoe UI" w:hAnsi="Segoe UI"/>
+                <w:color w:val="16302B"/>
+                <w:sz w:val="21"/>
+              </w:rPr>
+              <w:t>Kém phù hợp làm app/website</w:t>
+            </w:r>
+          </w:p>
+        </w:tc>
+        <w:tc>
+          <w:tcPr>
+            <w:tcW w:type="dxa" w:w="3742"/>
+          </w:tcPr>
+          <w:p>
+            <w:pPr>
+              <w:spacing w:after="40" w:before="40"/>
+            </w:pPr>
+            <w:r>
+              <w:rPr>
+                <w:rFonts w:ascii="Segoe UI" w:hAnsi="Segoe UI"/>
+                <w:color w:val="16302B"/>
+                <w:sz w:val="21"/>
+              </w:rPr>
+              <w:t>Thân thiện logo, ứng dụng, mạng xã hội</w:t>
+            </w:r>
+          </w:p>
+        </w:tc>
+      </w:tr>
+      <w:tr>
+        <w:tc>
+          <w:tcPr>
+            <w:tcW w:type="dxa" w:w="2041"/>
+            <w:shd w:val="clear" w:color="auto" w:fill="F4FAF8"/>
+          </w:tcPr>
+          <w:p>
+            <w:pPr>
+              <w:spacing w:after="40" w:before="40"/>
+            </w:pPr>
+            <w:r>
+              <w:rPr>
+                <w:rFonts w:ascii="Segoe UI" w:hAnsi="Segoe UI"/>
+                <w:color w:val="16302B"/>
+                <w:sz w:val="21"/>
+              </w:rPr>
+              <w:t>Thông điệp</w:t>
+            </w:r>
+          </w:p>
+        </w:tc>
+        <w:tc>
+          <w:tcPr>
+            <w:tcW w:type="dxa" w:w="3175"/>
+            <w:shd w:val="clear" w:color="auto" w:fill="F4FAF8"/>
+          </w:tcPr>
+          <w:p>
+            <w:pPr>
+              <w:spacing w:after="40" w:before="40"/>
+            </w:pPr>
+            <w:r>
+              <w:rPr>
+                <w:rFonts w:ascii="Segoe UI" w:hAnsi="Segoe UI"/>
+                <w:color w:val="16302B"/>
+                <w:sz w:val="21"/>
+              </w:rPr>
+              <w:t>Mong ước chung chung</w:t>
+            </w:r>
+          </w:p>
+        </w:tc>
+        <w:tc>
+          <w:tcPr>
+            <w:tcW w:type="dxa" w:w="3742"/>
+            <w:shd w:val="clear" w:color="auto" w:fill="F4FAF8"/>
+          </w:tcPr>
+          <w:p>
+            <w:pPr>
+              <w:spacing w:after="40" w:before="40"/>
+            </w:pPr>
+            <w:r>
+              <w:rPr>
+                <w:rFonts w:ascii="Segoe UI" w:hAnsi="Segoe UI"/>
+                <w:color w:val="16302B"/>
+                <w:sz w:val="21"/>
+              </w:rPr>
+              <w:t>Nói đúng phương pháp: chăm sóc bằng đôi tay</w:t>
+            </w:r>
+          </w:p>
+        </w:tc>
+      </w:tr>
+    </w:tbl>
+    <w:p>
+      <w:pPr>
+        <w:spacing w:after="200" w:before="40"/>
+        <w:jc w:val="center"/>
+      </w:pPr>
+      <w:r>
+        <w:rPr>
+          <w:b w:val="0"/>
+          <w:i/>
+          <w:color w:val="5C7370"/>
+          <w:sz w:val="19"/>
+        </w:rPr>
+        <w:t>Bảng 8. So sánh tên gọi cũ và mới</w:t>
       </w:r>
     </w:p>
     <w:sectPr>

</xml_diff>

<commit_message>
Slide 14+S11: 'Nền tảng đặt lịch đa kênh & CRM' (kênh đầu tiên: Zalo Mini App) + giải thích trong DOCX; KHÔI PHỤC hiệu ứng PPTX — đã tìm ra thủ phạm repair (dangling spid 25 vs 26), sửa PLAN, test OK bằng PowerPoint COM trên máy người dùng
</commit_message>
<xml_diff>
--- a/CareTouch-bao-cao.docx
+++ b/CareTouch-bao-cao.docx
@@ -4218,7 +4218,7 @@
           <w:i w:val="0"/>
           <w:color w:val="16302B"/>
         </w:rPr>
-        <w:t>mở cơ sở thứ hai, xây dựng Zalo Mini App đặt lịch và nhắc liệu trình, huy động vốn mở rộng.</w:t>
+        <w:t>mở cơ sở thứ hai, xây dựng nền tảng đặt lịch đa kênh &amp; CRM (kênh triển khai đầu tiên: Zalo Mini App), huy động vốn mở rộng.</w:t>
       </w:r>
     </w:p>
     <w:p>
@@ -4278,7 +4278,17 @@
           <w:i w:val="0"/>
           <w:color w:val="16302B"/>
         </w:rPr>
-        <w:t>Khuyến nghị của nhóm: bắt đầu với quy mô nhỏ để kiểm chứng quy trình — mở buổi trị liệu đầu tiên, phục vụ thật tốt nhóm khách đầu tiên, đo tỷ lệ quay lại từ tháng đầu; hoàn thiện hồ sơ pháp lý và quy trình khảo sát thể trạng an toàn trước khi mở rộng. Mục tiêu năm đầu tiên là tỷ lệ khách quay lại từ 55% trở lên và doanh thu 88 triệu đồng/tháng vào tháng thứ 12 theo dự phóng. Tổng nhu cầu vốn khởi đầu 165 triệu đồng được thiết kế để dự án an toàn về dòng tiền trong suốt giai đoạn kiểm chứng. Với khoản vốn gọi đề xuất minh họa 500 triệu đồng, nhóm dự kiến mở rộng lên 2 cơ sở và xây dựng Zalo Mini App đặt lịch (mini-app chạy trên nền tảng Zalo) trong năm thứ hai. Phân bổ vốn đề xuất: 200 triệu đồng cho cơ sở thứ hai, 80 triệu đồng cho nền tảng đặt lịch Zalo Mini App, 100 triệu đồng cho marketing và tuyển đào tạo kỹ thuật viên, 120 triệu đồng vốn lưu động dự phòng. Hình thức huy động đề xuất là góp vốn đổi cổ phần, với tỷ lệ minh họa khoảng 12–15% cho khoản 500 triệu đồng (định giá cụ thể được xác lập khi đàm phán).</w:t>
+        <w:t>Khuyến nghị của nhóm: bắt đầu với quy mô nhỏ để kiểm chứng quy trình — mở buổi trị liệu đầu tiên, phục vụ thật tốt nhóm khách đầu tiên, đo tỷ lệ quay lại từ tháng đầu; hoàn thiện hồ sơ pháp lý và quy trình khảo sát thể trạng an toàn trước khi mở rộng. Mục tiêu năm đầu tiên là tỷ lệ khách quay lại từ 55% trở lên và doanh thu 88 triệu đồng/tháng vào tháng thứ 12 theo dự phóng. Tổng nhu cầu vốn khởi đầu 165 triệu đồng được thiết kế để dự án an toàn về dòng tiền trong suốt giai đoạn kiểm chứng. Với khoản vốn gọi đề xuất minh họa 500 triệu đồng, nhóm dự kiến mở rộng lên 2 cơ sở và xây dựng nền tảng đặt lịch đa kênh &amp; CRM trong năm thứ hai. Phân bổ vốn đề xuất: 200 triệu đồng cho cơ sở thứ hai, 80 triệu đồng cho nền tảng đặt lịch đa kênh &amp; CRM, 100 triệu đồng cho marketing và tuyển đào tạo kỹ thuật viên, 120 triệu đồng vốn lưu động dự phòng. Hình thức huy động đề xuất là góp vốn đổi cổ phần, với tỷ lệ minh họa khoảng 12–15% cho khoản 500 triệu đồng (định giá cụ thể được xác lập khi đàm phán).</w:t>
+      </w:r>
+    </w:p>
+    <w:p>
+      <w:r>
+        <w:rPr>
+          <w:b w:val="0"/>
+          <w:i w:val="0"/>
+          <w:color w:val="16302B"/>
+        </w:rPr>
+        <w:t>Nền tảng đặt lịch đa kênh &amp; CRM là lớp công nghệ mỏng của dự án: tiếp nhận yêu cầu đặt lịch từ mọi kênh tiếp xúc của khách hàng (Zalo Mini App, Zalo OA/hotline, biểu mẫu web), tự động nhắc lịch liệu trình và ghi nhận lịch sử buổi trị liệu của từng khách hàng vào hệ thống CRM. Thiết kế này giúp nhóm giữ khách theo liệu trình, đo chính xác tỷ lệ khách quay lại — chỉ số quan trọng nhất của mô hình — và không phụ thuộc vào một kênh duy nhất. Kênh triển khai đầu tiên chọn Zalo Mini App vì chi phí phát triển thấp và tiếp cận đúng nhóm khách trung niên – cao tuổi thông qua con cháu đặt lịch hộ.</w:t>
       </w:r>
     </w:p>
     <w:p>

</xml_diff>